<commit_message>
docs: address cost estimate review and include monitoring alarms
</commit_message>
<xml_diff>
--- a/docs/cost-estimate/group2-aws-pricing-team-guide.docx
+++ b/docs/cost-estimate/group2-aws-pricing-team-guide.docx
@@ -7,22 +7,17 @@
         <w:pStyle w:val="Title"/>
       </w:pPr>
       <w:r>
+        <w:rPr>
+          <w:color w:val="000000"/>
+        </w:rPr>
         <w:t>AWS Pricing Calculator Procedure and Cost Estimate</w:t>
       </w:r>
     </w:p>
     <w:p>
       <w:r>
         <w:t>Smart Asset Lifecycle Tracker • Group 2</w:t>
-      </w:r>
-      <w:r>
         <w:br/>
-        <w:t>Prepared by</w:t>
-      </w:r>
-      <w:r>
-        <w:t xml:space="preserve"> Group 2</w:t>
-      </w:r>
-      <w:r>
-        <w:t xml:space="preserve"> • 3 October 2026 • Version 2.1</w:t>
+        <w:t>Prepared by Group 2 • 4 October 2026 • Version 2.2</w:t>
       </w:r>
     </w:p>
     <w:p>
@@ -30,6 +25,9 @@
         <w:pStyle w:val="Heading1"/>
       </w:pPr>
       <w:r>
+        <w:rPr>
+          <w:color w:val="000000"/>
+        </w:rPr>
         <w:t>Source files used for the estimate</w:t>
       </w:r>
     </w:p>
@@ -237,6 +235,108 @@
           </w:p>
         </w:tc>
       </w:tr>
+      <w:tr>
+        <w:trPr>
+          <w:cantSplit/>
+        </w:trPr>
+        <w:tc>
+          <w:tcPr>
+            <w:tcW w:w="4536" w:type="dxa"/>
+            <w:tcBorders>
+              <w:top w:val="single" w:sz="4" w:space="0" w:color="D9D9D9"/>
+              <w:left w:val="single" w:sz="4" w:space="0" w:color="D9D9D9"/>
+              <w:bottom w:val="single" w:sz="4" w:space="0" w:color="D9D9D9"/>
+              <w:right w:val="single" w:sz="4" w:space="0" w:color="D9D9D9"/>
+            </w:tcBorders>
+            <w:tcMar>
+              <w:top w:w="55" w:type="dxa"/>
+              <w:left w:w="55" w:type="dxa"/>
+              <w:bottom w:w="55" w:type="dxa"/>
+              <w:right w:w="55" w:type="dxa"/>
+            </w:tcMar>
+            <w:vAlign w:val="center"/>
+          </w:tcPr>
+          <w:p>
+            <w:r>
+              <w:t>scripts/configure-cloudwatch.sh</w:t>
+            </w:r>
+          </w:p>
+        </w:tc>
+        <w:tc>
+          <w:tcPr>
+            <w:tcW w:w="5688" w:type="dxa"/>
+            <w:tcBorders>
+              <w:top w:val="single" w:sz="4" w:space="0" w:color="D9D9D9"/>
+              <w:left w:val="single" w:sz="4" w:space="0" w:color="D9D9D9"/>
+              <w:bottom w:val="single" w:sz="4" w:space="0" w:color="D9D9D9"/>
+              <w:right w:val="single" w:sz="4" w:space="0" w:color="D9D9D9"/>
+            </w:tcBorders>
+            <w:tcMar>
+              <w:top w:w="55" w:type="dxa"/>
+              <w:left w:w="55" w:type="dxa"/>
+              <w:bottom w:w="55" w:type="dxa"/>
+              <w:right w:w="55" w:type="dxa"/>
+            </w:tcMar>
+            <w:vAlign w:val="center"/>
+          </w:tcPr>
+          <w:p>
+            <w:r>
+              <w:t>SNS topic, optional email subscription, three CloudWatch alarms and 30-day asset API / 14-day health log retention policies.</w:t>
+            </w:r>
+          </w:p>
+        </w:tc>
+      </w:tr>
+      <w:tr>
+        <w:trPr>
+          <w:cantSplit/>
+        </w:trPr>
+        <w:tc>
+          <w:tcPr>
+            <w:tcW w:w="4536" w:type="dxa"/>
+            <w:tcBorders>
+              <w:top w:val="single" w:sz="4" w:space="0" w:color="D9D9D9"/>
+              <w:left w:val="single" w:sz="4" w:space="0" w:color="D9D9D9"/>
+              <w:bottom w:val="single" w:sz="4" w:space="0" w:color="D9D9D9"/>
+              <w:right w:val="single" w:sz="4" w:space="0" w:color="D9D9D9"/>
+            </w:tcBorders>
+            <w:tcMar>
+              <w:top w:w="55" w:type="dxa"/>
+              <w:left w:w="55" w:type="dxa"/>
+              <w:bottom w:w="55" w:type="dxa"/>
+              <w:right w:w="55" w:type="dxa"/>
+            </w:tcMar>
+            <w:vAlign w:val="center"/>
+          </w:tcPr>
+          <w:p>
+            <w:r>
+              <w:t>docs/cloudwatch-monitoring.md</w:t>
+            </w:r>
+          </w:p>
+        </w:tc>
+        <w:tc>
+          <w:tcPr>
+            <w:tcW w:w="5688" w:type="dxa"/>
+            <w:tcBorders>
+              <w:top w:val="single" w:sz="4" w:space="0" w:color="D9D9D9"/>
+              <w:left w:val="single" w:sz="4" w:space="0" w:color="D9D9D9"/>
+              <w:bottom w:val="single" w:sz="4" w:space="0" w:color="D9D9D9"/>
+              <w:right w:val="single" w:sz="4" w:space="0" w:color="D9D9D9"/>
+            </w:tcBorders>
+            <w:tcMar>
+              <w:top w:w="55" w:type="dxa"/>
+              <w:left w:w="55" w:type="dxa"/>
+              <w:bottom w:w="55" w:type="dxa"/>
+              <w:right w:w="55" w:type="dxa"/>
+            </w:tcMar>
+            <w:vAlign w:val="center"/>
+          </w:tcPr>
+          <w:p>
+            <w:r>
+              <w:t>Monitoring configuration, subscription confirmation and inspection instructions.</w:t>
+            </w:r>
+          </w:p>
+        </w:tc>
+      </w:tr>
     </w:tbl>
     <w:p>
       <w:pPr>
@@ -245,7 +345,7 @@
     </w:p>
     <w:p>
       <w:r>
-        <w:t>The local develop branch was updated to commit 619ae93 before the review. The template was supplied as pasted content and samconfig.toml was supplied in the conversation. These sources describe the intended deployment; a live AWS resource inventory was not checked.</w:t>
+        <w:t>The original infrastructure baseline was develop commit 619ae93. This revision also reviews scripts/configure-cloudwatch.sh and docs/cloudwatch-monitoring.md on the PR branch at commit d943683. These sources describe the intended deployment and monitoring setup; a live AWS resource inventory was not checked.</w:t>
       </w:r>
     </w:p>
     <w:p>
@@ -253,12 +353,15 @@
         <w:pStyle w:val="Heading1"/>
       </w:pPr>
       <w:r>
+        <w:rPr>
+          <w:color w:val="000000"/>
+        </w:rPr>
         <w:t>Result and scope</w:t>
       </w:r>
     </w:p>
     <w:p>
       <w:r>
-        <w:t>This guide records how we built the estimate and provides inputs the team can reproduce. It supports the required Estimated monthly AWS cost submission and includes the requested daily view. For one small development and demonstration environment, the saved Calculator total is USD 3.25 per month, approximately USD 0.11 per day. The corrected Bedrock parameters are confirmed in the updated PDF, JSON and CSV exports.</w:t>
+        <w:t>This guide records how we built the estimate and provides inputs the team can reproduce. It supports the required Estimated monthly AWS cost submission and includes the requested daily view. For one small development and demonstration environment, the exported Calculator total is USD 3.55 per month, approximately USD 0.12 per day. The revised exports include three CloudWatch alarms and the corrected SNS monitoring description.</w:t>
       </w:r>
     </w:p>
     <w:tbl>
@@ -1074,44 +1177,34 @@
             <w:vAlign w:val="center"/>
           </w:tcPr>
           <w:p>
+            <w:r>
+              <w:t>Logs and three monitoring alarms</w:t>
+            </w:r>
+          </w:p>
+        </w:tc>
+        <w:tc>
+          <w:tcPr>
+            <w:tcW w:w="1728" w:type="dxa"/>
+            <w:tcBorders>
+              <w:top w:val="single" w:sz="4" w:space="0" w:color="D9D9D9"/>
+              <w:left w:val="single" w:sz="4" w:space="0" w:color="D9D9D9"/>
+              <w:bottom w:val="single" w:sz="4" w:space="0" w:color="D9D9D9"/>
+              <w:right w:val="single" w:sz="4" w:space="0" w:color="D9D9D9"/>
+            </w:tcBorders>
+            <w:tcMar>
+              <w:top w:w="55" w:type="dxa"/>
+              <w:left w:w="55" w:type="dxa"/>
+              <w:bottom w:w="55" w:type="dxa"/>
+              <w:right w:w="55" w:type="dxa"/>
+            </w:tcMar>
+            <w:vAlign w:val="center"/>
+          </w:tcPr>
+          <w:p>
             <w:pPr>
-              <w:spacing w:after="20"/>
-            </w:pPr>
-            <w:r>
-              <w:rPr>
-                <w:sz w:val="17"/>
-              </w:rPr>
-              <w:t>Application logs</w:t>
-            </w:r>
-          </w:p>
-        </w:tc>
-        <w:tc>
-          <w:tcPr>
-            <w:tcW w:w="1728" w:type="dxa"/>
-            <w:tcBorders>
-              <w:top w:val="single" w:sz="4" w:space="0" w:color="D9D9D9"/>
-              <w:left w:val="single" w:sz="4" w:space="0" w:color="D9D9D9"/>
-              <w:bottom w:val="single" w:sz="4" w:space="0" w:color="D9D9D9"/>
-              <w:right w:val="single" w:sz="4" w:space="0" w:color="D9D9D9"/>
-            </w:tcBorders>
-            <w:tcMar>
-              <w:top w:w="55" w:type="dxa"/>
-              <w:left w:w="55" w:type="dxa"/>
-              <w:bottom w:w="55" w:type="dxa"/>
-              <w:right w:w="55" w:type="dxa"/>
-            </w:tcMar>
-            <w:vAlign w:val="center"/>
-          </w:tcPr>
-          <w:p>
-            <w:pPr>
-              <w:spacing w:after="20"/>
               <w:jc w:val="right"/>
             </w:pPr>
             <w:r>
-              <w:rPr>
-                <w:sz w:val="17"/>
-              </w:rPr>
-              <w:t>0.50</w:t>
+              <w:t>0.80</w:t>
             </w:r>
           </w:p>
         </w:tc>
@@ -1260,14 +1353,8 @@
             <w:vAlign w:val="center"/>
           </w:tcPr>
           <w:p>
-            <w:pPr>
-              <w:spacing w:after="20"/>
-            </w:pPr>
-            <w:r>
-              <w:rPr>
-                <w:sz w:val="17"/>
-              </w:rPr>
-              <w:t>Planned</w:t>
+            <w:r>
+              <w:t>Monitoring script</w:t>
             </w:r>
           </w:p>
         </w:tc>
@@ -1569,14 +1656,10 @@
           </w:tcPr>
           <w:p>
             <w:pPr>
-              <w:spacing w:after="20"/>
               <w:jc w:val="right"/>
             </w:pPr>
             <w:r>
-              <w:rPr>
-                <w:sz w:val="17"/>
-              </w:rPr>
-              <w:t>3.25</w:t>
+              <w:t>3.55</w:t>
             </w:r>
           </w:p>
         </w:tc>
@@ -1589,19 +1672,18 @@
     </w:p>
     <w:p>
       <w:r>
-        <w:t>Upfront cost: USD 0.00. Calculator 12 month total: USD 39.00. Daily average: 3.25 ÷ 30 = USD 0.1083. This is an average allocation of a monthly estimate; actual daily usage and charges vary.</w:t>
-      </w:r>
-    </w:p>
-    <w:p>
-      <w:r>
-        <w:br w:type="page"/>
+        <w:t>Upfront cost: USD 0.00. Calculator 12 month total: USD 42.60. Daily average: 3.55 ÷ 30 = USD 0.1183. This is an average allocation of a monthly estimate; actual daily usage and charges vary.</w:t>
       </w:r>
     </w:p>
     <w:p>
       <w:pPr>
         <w:pStyle w:val="Heading1"/>
+        <w:pageBreakBefore/>
       </w:pPr>
       <w:r>
+        <w:rPr>
+          <w:color w:val="000000"/>
+        </w:rPr>
         <w:lastRenderedPageBreak/>
         <w:t>Procedure used to build and save the estimate</w:t>
       </w:r>
@@ -1613,7 +1695,7 @@
     </w:p>
     <w:p>
       <w:r>
-        <w:t>2. Use the source files to identify the services and settings. The repository search for EventBridge, Scheduler and SNS resource definitions returned no matches; those two service estimates were therefore labeled Planned.</w:t>
+        <w:t>2. Review all four source files. Identify services defined in the SAM template and monitoring resources configured separately by the CLI script. No EventBridge or Scheduler resources were found in the reviewed repository, so EventBridge remains a planned allowance. The monitoring script creates the SNS topic and three CloudWatch alarms outside the SAM stack; verify whether it has run in the target environment.</w:t>
       </w:r>
     </w:p>
     <w:p>
@@ -1623,7 +1705,7 @@
     </w:p>
     <w:p>
       <w:r>
-        <w:t>4. Enter the inputs recorded on the following pages. Give each entry a description, inspect Show calculations, and choose Save and view summary. The Calculator displays costs monthly even though we use a daily average in the presentation.</w:t>
+        <w:t>4. Enter the inputs recorded on the following pages. Give each entry a description and inspect Show calculations. Save new entries or choose Update when editing an existing entry. Include three standard-resolution alarm metrics under CloudWatch Dashboards and Alarms. The Calculator displays costs monthly; divide the summary total by 30 for the daily view.</w:t>
       </w:r>
     </w:p>
     <w:p>
@@ -1633,7 +1715,7 @@
     </w:p>
     <w:p>
       <w:r>
-        <w:t>6. Review both pages of the summary. There are 12 entries across 11 service types. Rename the estimate with Edit, enter the name below and click Save. Use Share, then Agree and continue to create the public share link.</w:t>
+        <w:t>6. Review both pages of the summary: 12 entries across 11 service types. Use the estimate name below. Use Share and Agree and continue, then export PDF, JSON and CSV from the same configuration. Use the Share URL recorded in the JSON export as the reference link in the documentation. Compare totals and export dates before replacing the repository files.</w:t>
       </w:r>
     </w:p>
     <w:p>
@@ -1641,6 +1723,9 @@
         <w:pStyle w:val="Heading2"/>
       </w:pPr>
       <w:r>
+        <w:rPr>
+          <w:color w:val="000000"/>
+        </w:rPr>
         <w:t>Saved estimate</w:t>
       </w:r>
     </w:p>
@@ -1651,12 +1736,12 @@
     </w:p>
     <w:p>
       <w:r>
-        <w:t>https://calculator.aws/#/estimate?id=65e464b771d2eaca71851be32afdadcb4ebe475d</w:t>
+        <w:t>https://calculator.aws/#/estimate?id=98808bdeb1af05aa13d820d3abe167b94a322e0a</w:t>
       </w:r>
     </w:p>
     <w:p>
       <w:r>
-        <w:t>Anyone with this link can view the estimate. This is the final link supplied by Mladen after the Bedrock update. The updated JSON also records a separate exported snapshot at https://calculator.aws/#/estimate?id=fba3992f9a8ce8392e8436d1ec6c9525d10f4cb1. The PDF, JSON and CSV files named Smart Asset Lifecycle Tracker – Group 2 – Dev Cost Estimate(1) confirm the corrected parameters and totals. Screenshots supplement settings omitted from the exports, including Lambda memory and duration. JSON splits DynamoDB and S3 into subservices, producing 14 records for the 12 summary entries.</w:t>
+        <w:t>The exports are dated 4 October 2026 and all report USD 3.55/month. Use the reference link above, which is recorded in the JSON export. Keep group2-aws-cost-estimate.pdf, group2-aws-cost-estimate.json, group2-aws-cost-estimate.csv and group2-aws-pricing-team-guide.docx in docs/cost-estimate/. Screenshots supplement settings omitted from exports, including Lambda memory and duration. JSON splits DynamoDB and S3 into subservices, producing 14 records for the 12 summary entries.</w:t>
       </w:r>
     </w:p>
     <w:p>
@@ -1664,6 +1749,9 @@
         <w:pStyle w:val="Heading1"/>
       </w:pPr>
       <w:r>
+        <w:rPr>
+          <w:color w:val="000000"/>
+        </w:rPr>
         <w:t>Lambda and API Gateway inputs</w:t>
       </w:r>
     </w:p>
@@ -2072,15 +2160,14 @@
       </w:r>
     </w:p>
     <w:p>
-      <w:r>
-        <w:br w:type="page"/>
-      </w:r>
-    </w:p>
-    <w:p>
       <w:pPr>
         <w:pStyle w:val="Heading1"/>
+        <w:pageBreakBefore/>
       </w:pPr>
       <w:r>
+        <w:rPr>
+          <w:color w:val="000000"/>
+        </w:rPr>
         <w:lastRenderedPageBreak/>
         <w:t>DynamoDB inputs</w:t>
       </w:r>
@@ -2688,6 +2775,9 @@
         <w:pStyle w:val="Heading1"/>
       </w:pPr>
       <w:r>
+        <w:rPr>
+          <w:color w:val="000000"/>
+        </w:rPr>
         <w:t>S3 inputs</w:t>
       </w:r>
     </w:p>
@@ -3289,6 +3379,9 @@
         <w:pStyle w:val="Heading1"/>
       </w:pPr>
       <w:r>
+        <w:rPr>
+          <w:color w:val="000000"/>
+        </w:rPr>
         <w:t>Cognito inputs</w:t>
       </w:r>
     </w:p>
@@ -3634,15 +3727,14 @@
       </w:r>
     </w:p>
     <w:p>
-      <w:r>
-        <w:br w:type="page"/>
-      </w:r>
-    </w:p>
-    <w:p>
       <w:pPr>
         <w:pStyle w:val="Heading1"/>
+        <w:pageBreakBefore/>
       </w:pPr>
       <w:r>
+        <w:rPr>
+          <w:color w:val="000000"/>
+        </w:rPr>
         <w:lastRenderedPageBreak/>
         <w:t>Bedrock inputs</w:t>
       </w:r>
@@ -4305,7 +4397,7 @@
     </w:p>
     <w:p>
       <w:r>
-        <w:t>The updated PDF displays Bedrock as USD 0.48/month, while JSON lists USD 0.47/month and the configuration screen displayed USD 0.47 before saving. All three exports agree on the total of USD 3.25/month. The cost table uses the PDF service value; the small export display difference has not been reconciled to an underlying detailed calculation.</w:t>
+        <w:t>The PDF displays Bedrock as USD 0.48/month, while JSON lists USD 0.47/month and CSV records USD 0.475 before rounding. These are export display differences. All three exports report the same overall monthly total of USD 3.55. The cost table follows the PDF component values.</w:t>
       </w:r>
     </w:p>
     <w:p>
@@ -4323,6 +4415,9 @@
         <w:pStyle w:val="Heading1"/>
       </w:pPr>
       <w:r>
+        <w:rPr>
+          <w:color w:val="000000"/>
+        </w:rPr>
         <w:t>CloudWatch inputs</w:t>
       </w:r>
     </w:p>
@@ -4833,14 +4928,59 @@
             <w:vAlign w:val="center"/>
           </w:tcPr>
           <w:p>
-            <w:pPr>
-              <w:spacing w:after="20"/>
-            </w:pPr>
-            <w:r>
-              <w:rPr>
-                <w:sz w:val="17"/>
-              </w:rPr>
-              <w:t>No usage entered for custom metrics, API calls, Insights queries, dashboards, alarms or canaries</w:t>
+            <w:r>
+              <w:t>No usage entered for custom metrics, API calls, Insights queries, dashboards or canaries</w:t>
+            </w:r>
+          </w:p>
+        </w:tc>
+      </w:tr>
+      <w:tr>
+        <w:trPr>
+          <w:cantSplit/>
+        </w:trPr>
+        <w:tc>
+          <w:tcPr>
+            <w:tcW w:w="4536" w:type="dxa"/>
+            <w:tcBorders>
+              <w:top w:val="single" w:sz="4" w:space="0" w:color="D9D9D9"/>
+              <w:left w:val="single" w:sz="4" w:space="0" w:color="D9D9D9"/>
+              <w:bottom w:val="single" w:sz="4" w:space="0" w:color="D9D9D9"/>
+              <w:right w:val="single" w:sz="4" w:space="0" w:color="D9D9D9"/>
+            </w:tcBorders>
+            <w:tcMar>
+              <w:top w:w="55" w:type="dxa"/>
+              <w:left w:w="55" w:type="dxa"/>
+              <w:bottom w:w="55" w:type="dxa"/>
+              <w:right w:w="55" w:type="dxa"/>
+            </w:tcMar>
+            <w:vAlign w:val="center"/>
+          </w:tcPr>
+          <w:p>
+            <w:r>
+              <w:t>Standard resolution alarm metrics</w:t>
+            </w:r>
+          </w:p>
+        </w:tc>
+        <w:tc>
+          <w:tcPr>
+            <w:tcW w:w="5688" w:type="dxa"/>
+            <w:tcBorders>
+              <w:top w:val="single" w:sz="4" w:space="0" w:color="D9D9D9"/>
+              <w:left w:val="single" w:sz="4" w:space="0" w:color="D9D9D9"/>
+              <w:bottom w:val="single" w:sz="4" w:space="0" w:color="D9D9D9"/>
+              <w:right w:val="single" w:sz="4" w:space="0" w:color="D9D9D9"/>
+            </w:tcBorders>
+            <w:tcMar>
+              <w:top w:w="55" w:type="dxa"/>
+              <w:left w:w="55" w:type="dxa"/>
+              <w:bottom w:w="55" w:type="dxa"/>
+              <w:right w:w="55" w:type="dxa"/>
+            </w:tcMar>
+            <w:vAlign w:val="center"/>
+          </w:tcPr>
+          <w:p>
+            <w:r>
+              <w:t>3; USD 0.30/month</w:t>
             </w:r>
           </w:p>
         </w:tc>
@@ -4853,7 +4993,7 @@
     </w:p>
     <w:p>
       <w:r>
-        <w:t>The saved CloudWatch estimate is USD 0.50/month. Log volume is a planning assumption. The template does not define log retention, so the one month retention used in the estimate does not configure the deployed log groups. Confirm and set an appropriate retention period separately.</w:t>
+        <w:t>The saved CloudWatch estimate is USD 0.80/month, including USD 0.30 for three standard-resolution alarm metrics. Log volume is a planning assumption. The monitoring script sets 30-day retention for /aws/lambda/smart-asset-api-&lt;env&gt; and 14-day retention for /aws/lambda/smart-asset-health-&lt;env&gt;. The photo-upload, photo-analysis and photo-analysis-api log groups have no explicit retention configured in the reviewed repository. Configure retention for those three and verify the script policies in the target environment. The Calculator assumes one month for log storage; it does not change deployed retention policies.</w:t>
       </w:r>
     </w:p>
     <w:p>
@@ -4861,6 +5001,9 @@
         <w:pStyle w:val="Heading2"/>
       </w:pPr>
       <w:r>
+        <w:rPr>
+          <w:color w:val="000000"/>
+        </w:rPr>
         <w:t>How these assumptions affect the daily figure</w:t>
       </w:r>
     </w:p>
@@ -4870,15 +5013,14 @@
       </w:r>
     </w:p>
     <w:p>
-      <w:r>
-        <w:br w:type="page"/>
-      </w:r>
-    </w:p>
-    <w:p>
       <w:pPr>
         <w:pStyle w:val="Heading1"/>
+        <w:pageBreakBefore/>
       </w:pPr>
       <w:r>
+        <w:rPr>
+          <w:color w:val="000000"/>
+        </w:rPr>
         <w:lastRenderedPageBreak/>
         <w:t>EventBridge and SNS inputs</w:t>
       </w:r>
@@ -5327,14 +5469,8 @@
             <w:vAlign w:val="center"/>
           </w:tcPr>
           <w:p>
-            <w:pPr>
-              <w:spacing w:after="20"/>
-            </w:pPr>
-            <w:r>
-              <w:rPr>
-                <w:sz w:val="17"/>
-              </w:rPr>
-              <w:t>Planned asset lifecycle notifications</w:t>
+            <w:r>
+              <w:t>CloudWatch alarm and recovery email notifications</w:t>
             </w:r>
           </w:p>
         </w:tc>
@@ -5599,7 +5735,7 @@
     </w:p>
     <w:p>
       <w:r>
-        <w:t>The accepted units were per month, so the final EventBridge estimate uses 10,000 events, not the earlier million-event fallback. Saved results: EventBridge USD 0.01/month and SNS USD 0.02/month. The supplied repository search showed no resources for these services; confirm any manual or subsequent deployment before describing them as provisioned.</w:t>
+        <w:t>EventBridge uses 10,000 custom events per month and remains a planned workload, costing USD 0.01/month. The monitoring script creates the smart-asset-tracker-alerts SNS topic, optionally adds an email subscription and connects three alarms for errors, throttles and API 5XX responses. SNS is configured outside the SAM stack; its 1,000 requests and 2,000 email notifications per month are usage assumptions, costing USD 0.02/month. The script connects both alarm and recovery notifications. Its presence does not confirm execution in every environment.</w:t>
       </w:r>
     </w:p>
     <w:p>
@@ -5607,6 +5743,9 @@
         <w:pStyle w:val="Heading1"/>
       </w:pPr>
       <w:r>
+        <w:rPr>
+          <w:color w:val="000000"/>
+        </w:rPr>
         <w:t>Amplify inputs</w:t>
       </w:r>
     </w:p>
@@ -6145,6 +6284,9 @@
         <w:pStyle w:val="Heading1"/>
       </w:pPr>
       <w:r>
+        <w:rPr>
+          <w:color w:val="000000"/>
+        </w:rPr>
         <w:t>X Ray inputs</w:t>
       </w:r>
     </w:p>
@@ -6490,27 +6632,26 @@
       </w:r>
     </w:p>
     <w:p>
-      <w:r>
-        <w:br w:type="page"/>
-      </w:r>
-    </w:p>
-    <w:p>
       <w:pPr>
         <w:pStyle w:val="Heading1"/>
+        <w:pageBreakBefore/>
       </w:pPr>
       <w:r>
+        <w:rPr>
+          <w:color w:val="000000"/>
+        </w:rPr>
         <w:lastRenderedPageBreak/>
         <w:t>Checks before submission</w:t>
       </w:r>
     </w:p>
     <w:p>
       <w:r>
-        <w:t>The estimate includes all nine services named in the submission requirement, plus Amplify hosting and X-Ray tracing. Its USD 3.25 total includes the planned EventBridge and SNS usage. It covers one assumed environment in us-east-1; separate team deployments are additional.</w:t>
+        <w:t>The estimate includes all nine services named in the submission requirement, plus Amplify hosting and X-Ray tracing. Its USD 3.55 total includes planned EventBridge usage and SNS monitoring notifications. It covers one assumed environment in us-east-1; separate team deployments are additional.</w:t>
       </w:r>
     </w:p>
     <w:p>
       <w:r>
-        <w:t>Report the updated Calculator total and retain the workload and deployment assumptions in this guide. The entry values are rounded to cents. The total 12 month figure is the Calculator summary; some individual 12 month values use underlying unrounded costs. For presentation, say approximately USD 0.11 per day or USD 3 per month, while retaining USD 3.25 as the exact displayed monthly total.</w:t>
+        <w:t>Report the exported Calculator total and retain the workload and deployment assumptions in this guide. Component values are displayed at different precision in the exports; some 12 month values use underlying unrounded costs. For presentation, say approximately USD 0.12 per day and USD 3.55 per month. The Calculator summary reports USD 42.60 over 12 months.</w:t>
       </w:r>
     </w:p>
     <w:p>
@@ -6523,6 +6664,9 @@
         <w:pStyle w:val="Heading2"/>
       </w:pPr>
       <w:r>
+        <w:rPr>
+          <w:color w:val="000000"/>
+        </w:rPr>
         <w:t>Team validation items</w:t>
       </w:r>
     </w:p>
@@ -6531,7 +6675,7 @@
         <w:pStyle w:val="ListBullet"/>
       </w:pPr>
       <w:r>
-        <w:t>Confirm the deployed inventory, region and Cognito feature plan. Identify whether EventBridge and SNS have since been implemented.</w:t>
+        <w:t>Confirm the deployed inventory, region and Cognito feature plan. Verify whether EventBridge has been implemented and whether the monitoring script has configured the SNS topic, subscriptions and three alarms in the target environment.</w:t>
       </w:r>
     </w:p>
     <w:p>
@@ -6539,7 +6683,7 @@
         <w:pStyle w:val="ListBullet"/>
       </w:pPr>
       <w:r>
-        <w:t>The updated PDF, JSON and CSV confirm USD 3.25/month and the corrected Bedrock inputs. Retain these updated exports as evidence; reconcile Bedrock call volume with the 100 photo Lambda requests if a consistent workload scenario is required.</w:t>
+        <w:t>The PDF, JSON and CSV confirm USD 3.55/month, three CloudWatch alarm metrics and the corrected Bedrock inputs. Retain these exports as evidence; reconcile Bedrock call volume with the 100 photo Lambda requests if a consistent workload scenario is required.</w:t>
       </w:r>
     </w:p>
     <w:p>
@@ -6555,7 +6699,7 @@
         <w:pStyle w:val="ListBullet"/>
       </w:pPr>
       <w:r>
-        <w:t>Replace assumed Lambda durations, log volumes, token counts and build minutes with observed usage when available. Confirm actual log retention and tracing sampling.</w:t>
+        <w:t>Replace assumed Lambda durations, log volumes, token counts and build minutes with observed usage when available. Verify 30-day asset API and 14-day health log retention, configure retention for the three photo workflow log groups, and confirm tracing sampling.</w:t>
       </w:r>
     </w:p>
     <w:p>
@@ -6571,6 +6715,9 @@
         <w:pStyle w:val="Heading1"/>
       </w:pPr>
       <w:r>
+        <w:rPr>
+          <w:color w:val="000000"/>
+        </w:rPr>
         <w:t>Cost monitoring and cleanup</w:t>
       </w:r>
     </w:p>
@@ -6586,16 +6733,17 @@
     </w:p>
     <w:p>
       <w:r>
-        <w:t>Review retained table data and backups, S3 objects, CloudWatch log groups, externally managed Amplify hosting, and project-owned SAM deployment artifacts. Coordinate ownership before removing shared deployment bucket content. Stop any planned schedules and notifications if they were later deployed. Recheck Billing after usage reporting catches up.</w:t>
+        <w:t>Review retained table data and backups, S3 objects, CloudWatch log groups, externally managed Amplify hosting and project-owned SAM deployment artifacts. Coordinate ownership before removing shared deployment bucket content. Delete the script-created alarms smart-asset-api-&lt;env&gt;-errors, smart-asset-api-&lt;env&gt;-throttles and smart-asset-api-&lt;env&gt;-5xx when removing that environment; stack deletion does not remove them. Review SNS subscriptions and smart-asset-tracker-alerts separately. The topic has no environment suffix and may be shared: check other environments before deleting the topic or shared subscriptions. Remove them only when no longer needed. Disable or delete separately deployed EventBridge rules or schedules for the removed environment. Recheck Billing after usage reporting catches up.</w:t>
       </w:r>
     </w:p>
     <w:p>
       <w:r>
-        <w:t>This guide records estimation work only. No AWS deployment settings, repository files, budgets or resources were changed or deleted as part of preparing it.</w:t>
+        <w:t>This guide records estimation work and documentation updates. No AWS deployment settings, budgets, retention policies or resources were changed or deleted as part of preparing it.</w:t>
       </w:r>
     </w:p>
     <w:sectPr>
       <w:footerReference w:type="default" r:id="rId8"/>
+      <w:headerReference w:type="default" r:id="rId11"/>
       <w:pgSz w:w="12240" w:h="15840"/>
       <w:pgMar w:top="936" w:right="1008" w:bottom="936" w:left="1008" w:header="720" w:footer="720" w:gutter="0"/>
       <w:cols w:space="720"/>
@@ -6637,29 +6785,10 @@
       <w:pStyle w:val="Footer"/>
     </w:pPr>
     <w:r>
-      <w:rPr>
-        <w:sz w:val="16"/>
-      </w:rPr>
-      <w:t xml:space="preserve">Smart Asset Lifecycle Tracker | AWS pricing guide | 3 October 2026 | </w:t>
+      <w:t xml:space="preserve">Smart Asset Lifecycle Tracker | AWS pricing guide | 4 October 2026 | </w:t>
     </w:r>
-    <w:r>
-      <w:fldChar w:fldCharType="begin"/>
-    </w:r>
-    <w:r>
-      <w:instrText>PAGE</w:instrText>
-    </w:r>
-    <w:r>
-      <w:fldChar w:fldCharType="separate"/>
-    </w:r>
-    <w:r>
-      <w:rPr>
-        <w:noProof/>
-      </w:rPr>
-      <w:t>1</w:t>
-    </w:r>
-    <w:r>
-      <w:fldChar w:fldCharType="end"/>
-    </w:r>
+    <w:r/>
+    <w:fldSimple w:instr="PAGE"/>
   </w:p>
 </w:ftr>
 </file>
@@ -6687,6 +6816,16 @@
     </w:p>
   </w:footnote>
 </w:footnotes>
+</file>
+
+<file path=word/header1.xml><?xml version="1.0" encoding="utf-8"?>
+<w:hdr xmlns:m="http://schemas.openxmlformats.org/officeDocument/2006/math" xmlns:mc="http://schemas.openxmlformats.org/markup-compatibility/2006" xmlns:mo="http://schemas.microsoft.com/office/mac/office/2008/main" xmlns:mv="urn:schemas-microsoft-com:mac:vml" xmlns:o="urn:schemas-microsoft-com:office:office" xmlns:r="http://schemas.openxmlformats.org/officeDocument/2006/relationships" xmlns:v="urn:schemas-microsoft-com:vml" xmlns:w10="urn:schemas-microsoft-com:office:word" xmlns:w14="http://schemas.microsoft.com/office/word/2010/wordml" xmlns:w="http://schemas.openxmlformats.org/wordprocessingml/2006/main" xmlns:wne="http://schemas.microsoft.com/office/word/2006/wordml" xmlns:wp14="http://schemas.microsoft.com/office/word/2010/wordprocessingDrawing" xmlns:wp="http://schemas.openxmlformats.org/drawingml/2006/wordprocessingDrawing" xmlns:wpc="http://schemas.microsoft.com/office/word/2010/wordprocessingCanvas" xmlns:wpg="http://schemas.microsoft.com/office/word/2010/wordprocessingGroup" xmlns:wpi="http://schemas.microsoft.com/office/word/2010/wordprocessingInk" xmlns:wps="http://schemas.microsoft.com/office/word/2010/wordprocessingShape" mc:Ignorable="w14 wp14">
+  <w:p>
+    <w:pPr>
+      <w:pStyle w:val="Header"/>
+    </w:pPr>
+  </w:p>
+</w:hdr>
 </file>
 
 <file path=word/numbering.xml><?xml version="1.0" encoding="utf-8"?>
@@ -7309,6 +7448,7 @@
       <w:rFonts w:asciiTheme="majorHAnsi" w:eastAsiaTheme="majorEastAsia" w:hAnsiTheme="majorHAnsi" w:cstheme="majorBidi"/>
       <w:b/>
       <w:bCs/>
+      <w:color w:val="000000"/>
       <w:sz w:val="30"/>
       <w:szCs w:val="28"/>
     </w:rPr>
@@ -7332,6 +7472,7 @@
       <w:rFonts w:asciiTheme="majorHAnsi" w:eastAsiaTheme="majorEastAsia" w:hAnsiTheme="majorHAnsi" w:cstheme="majorBidi"/>
       <w:b/>
       <w:bCs/>
+      <w:color w:val="000000"/>
       <w:sz w:val="22"/>
       <w:szCs w:val="26"/>
     </w:rPr>
@@ -7355,7 +7496,7 @@
       <w:rFonts w:asciiTheme="majorHAnsi" w:eastAsiaTheme="majorEastAsia" w:hAnsiTheme="majorHAnsi" w:cstheme="majorBidi"/>
       <w:b/>
       <w:bCs/>
-      <w:color w:val="4F81BD" w:themeColor="accent1"/>
+      <w:color w:val="000000"/>
     </w:rPr>
   </w:style>
   <w:style w:type="paragraph" w:styleId="Heading4">
@@ -7635,6 +7776,7 @@
     </w:pPr>
     <w:rPr>
       <w:rFonts w:asciiTheme="majorHAnsi" w:eastAsiaTheme="majorEastAsia" w:hAnsiTheme="majorHAnsi" w:cstheme="majorBidi"/>
+      <w:color w:val="000000"/>
       <w:spacing w:val="5"/>
       <w:kern w:val="28"/>
       <w:sz w:val="42"/>
@@ -7673,7 +7815,7 @@
       <w:rFonts w:asciiTheme="majorHAnsi" w:eastAsiaTheme="majorEastAsia" w:hAnsiTheme="majorHAnsi" w:cstheme="majorBidi"/>
       <w:i/>
       <w:iCs/>
-      <w:color w:val="4F81BD" w:themeColor="accent1"/>
+      <w:color w:val="000000"/>
       <w:spacing w:val="15"/>
       <w:sz w:val="24"/>
       <w:szCs w:val="24"/>

</xml_diff>